<commit_message>
docs: update project title to 'Likhibi: Computational Resource Curation, Contextual Language Modeling, and Prototype Neural Translation for Nagamese Creole'
</commit_message>
<xml_diff>
--- a/docs/Nagamese_NLP_10_Slide_Presentation.docx
+++ b/docs/Nagamese_NLP_10_Slide_Presentation.docx
@@ -154,7 +154,7 @@
         <w:rPr>
           <w:sz w:val="19"/>
         </w:rPr>
-        <w:t>Title: LIKHIBI: DEVELOPMENT OF NLP RESOURCES AND INTELLIGENT PREDICTIVE INPUT SYSTEM FOR NAGAMESE CREOLE</w:t>
+        <w:t>Title: Likhibi: Computational Resource Curation, Contextual Language Modeling, and Prototype Neural Translation for Nagamese Creole</w:t>
       </w:r>
     </w:p>
     <w:p>
@@ -266,7 +266,7 @@
                 <w:color w:val="2D3748"/>
                 <w:sz w:val="20"/>
               </w:rPr>
-              <w:t>Respected Project Coordinators Mr. Nzanthung Odyuo sir, Mr. Nokshangthemba sir, and evaluation committee members. I am [Your Name], presenting my project proposal: 'Likhibi: Development of NLP Resources and Intelligent Predictive Input System for Nagamese Creole'. Nagamese is the primary spoken lingua franca across Nagaland, but remains a Low-Resource Language in computer science. This project builds native computational NLP resources and an offline predictive text engine for mobile devices.</w:t>
+              <w:t>Respected Project Coordinators Mr. Nzanthung Odyuo sir, Mr. Nokshangthemba sir, and evaluation committee members. I am [Your Name], presenting my project proposal: 'Likhibi: Computational Resource Curation, Contextual Language Modeling, and Prototype Neural Translation for Nagamese Creole'. Nagamese is the primary spoken lingua franca across Nagaland, but remains a Low-Resource Language in computer science. This project builds native computational NLP resources and an offline predictive text engine for mobile devices.</w:t>
             </w:r>
           </w:p>
         </w:tc>

</xml_diff>